<commit_message>
DevOps pilot: cold-read fixes, French footer and typography, final-project label, handoff note
Co-Authored-By: Claude Opus 5.5 <noreply@anthropic.com>
</commit_message>
<xml_diff>
--- a/res/programmes/Ingenierie-DevOps-81h.docx
+++ b/res/programmes/Ingenierie-DevOps-81h.docx
@@ -64,7 +64,7 @@
         <w:pStyle w:val="ProgCoverSub"/>
       </w:pPr>
       <w:r>
-        <w:t>Programme de formation professionnelle</w:t>
+        <w:t>Construire, livrer et exploiter des applications avec une chaîne automatisée</w:t>
       </w:r>
     </w:p>
     <w:p>
@@ -92,7 +92,7 @@
         <w:t>Pour</w:t>
       </w:r>
       <w:r>
-        <w:t xml:space="preserve">   Développeurs, administrateurs système et ingénieurs IT qui évoluent vers des rôles DevOps</w:t>
+        <w:t xml:space="preserve">   Développeurs, administrateurs système et ingénieurs IT souhaitant évoluer vers des fonctions DevOps</w:t>
       </w:r>
     </w:p>
     <w:p>
@@ -106,7 +106,7 @@
         <w:t>Prépare à</w:t>
       </w:r>
       <w:r>
-        <w:t xml:space="preserve">   LPI DevOps Tools Engineer  ·  HashiCorp Terraform Associate  ·  GitHub Actions</w:t>
+        <w:t xml:space="preserve">   HashiCorp Terraform Associate  ·  GitHub Actions (GH-200)  ·  LPI DevOps Tools Engineer (thèmes principaux)</w:t>
       </w:r>
     </w:p>
     <w:tbl>
@@ -212,7 +212,7 @@
         <w:pStyle w:val="ProgBody"/>
       </w:pPr>
       <w:r>
-        <w:t>Ce programme mène les participants d’un dépôt Git partagé à une application surveillée en production, avec les outils que les équipes utilisent aujourd’hui. Il suit le parcours d’une modification : gestion de versions et collaboration, intégration et livraison continues avec Jenkins et GitHub Actions, qualité du code et gestion des artefacts, infrastructure provisionnée avec Terraform et configurée avec Ansible, puis métriques et alertes avec Prometheus et Grafana. Chaque chapitre est pratique, la même application est reprise d’une phase à l’autre, et le programme se termine par un projet final qui assemble toute la chaîne de livraison.</w:t>
+        <w:t>Ce programme suit une modification depuis le commit d’un développeur jusqu’à une application supervisée en production sur AWS. Les participants mettent en place la collaboration avec Git, construisent des pipelines d’intégration et de livraison continues avec Jenkins et GitHub Actions, ajoutent tests automatisés, seuils de qualité (quality gates) et artefacts versionnés, provisionnent l’infrastructure avec Terraform et configurent les serveurs avec Ansible, puis suivent le résultat grâce aux métriques, aux journaux et aux alertes. La même application est reprise dans toutes les phases, presque chaque chapitre se termine par un TP, et le programme s’achève par un projet final où les équipes assemblent toute la chaîne de livraison et la présentent.</w:t>
       </w:r>
     </w:p>
     <w:p>
@@ -220,7 +220,7 @@
         <w:pStyle w:val="Heading2"/>
       </w:pPr>
       <w:r>
-        <w:t>En un coup d’œil</w:t>
+        <w:t>Vue d’ensemble</w:t>
       </w:r>
     </w:p>
     <w:tbl>
@@ -276,7 +276,7 @@
               <w:keepNext/>
             </w:pPr>
             <w:r>
-              <w:t>Objet</w:t>
+              <w:t>Thèmes</w:t>
             </w:r>
           </w:p>
         </w:tc>
@@ -321,7 +321,7 @@
               <w:keepNext/>
             </w:pPr>
             <w:r>
-              <w:t>Culture DevOps &amp; collaboration</w:t>
+              <w:t>Culture DevOps et collaboration</w:t>
             </w:r>
           </w:p>
         </w:tc>
@@ -349,7 +349,7 @@
               <w:keepNext/>
             </w:pPr>
             <w:r>
-              <w:t>12 h</w:t>
+              <w:t>9 h</w:t>
             </w:r>
           </w:p>
         </w:tc>
@@ -379,7 +379,7 @@
               <w:keepNext/>
             </w:pPr>
             <w:r>
-              <w:t>Intégration &amp; livraison continues</w:t>
+              <w:t>Intégration et livraison continues</w:t>
             </w:r>
           </w:p>
         </w:tc>
@@ -393,7 +393,7 @@
               <w:keepNext/>
             </w:pPr>
             <w:r>
-              <w:t>Jenkins, GitHub Actions, SonarQube, Nexus</w:t>
+              <w:t>Jenkins, tests automatisés, SonarQube, Nexus, stratégies de déploiement, GitHub Actions</w:t>
             </w:r>
           </w:p>
         </w:tc>
@@ -407,7 +407,7 @@
               <w:keepNext/>
             </w:pPr>
             <w:r>
-              <w:t>21 h</w:t>
+              <w:t>24 h</w:t>
             </w:r>
           </w:p>
         </w:tc>
@@ -451,7 +451,7 @@
               <w:keepNext/>
             </w:pPr>
             <w:r>
-              <w:t>Gestion de configuration avec Ansible, provisionnement avec Terraform</w:t>
+              <w:t>Provisionnement AWS avec Terraform, gestion de configuration avec Ansible</w:t>
             </w:r>
           </w:p>
         </w:tc>
@@ -465,7 +465,7 @@
               <w:keepNext/>
             </w:pPr>
             <w:r>
-              <w:t>24 h</w:t>
+              <w:t>24 h</w:t>
             </w:r>
           </w:p>
         </w:tc>
@@ -495,7 +495,7 @@
               <w:keepNext/>
             </w:pPr>
             <w:r>
-              <w:t>Observabilité</w:t>
+              <w:t>Supervision</w:t>
             </w:r>
           </w:p>
         </w:tc>
@@ -509,7 +509,7 @@
               <w:keepNext/>
             </w:pPr>
             <w:r>
-              <w:t>Métriques et alertes Prometheus, tableaux de bord Grafana</w:t>
+              <w:t>Métriques et alertes Prometheus, tableaux de bord Grafana et journaux Loki</w:t>
             </w:r>
           </w:p>
         </w:tc>
@@ -523,7 +523,7 @@
               <w:keepNext/>
             </w:pPr>
             <w:r>
-              <w:t>6 h</w:t>
+              <w:t>6 h</w:t>
             </w:r>
           </w:p>
         </w:tc>
@@ -581,7 +581,7 @@
               <w:keepNext/>
             </w:pPr>
             <w:r>
-              <w:t>9 h</w:t>
+              <w:t>9 h</w:t>
             </w:r>
           </w:p>
         </w:tc>
@@ -604,11 +604,11 @@
           </w:tcPr>
           <w:p>
             <w:pPr>
-              <w:pStyle w:val="ProgTableMuted"/>
+              <w:pStyle w:val="ProgTableStrong"/>
               <w:keepNext/>
             </w:pPr>
             <w:r>
-              <w:t>Marge : rattrapage, révision, temps de lab supplémentaire</w:t>
+              <w:t>Réserve</w:t>
             </w:r>
           </w:p>
         </w:tc>
@@ -618,9 +618,12 @@
           </w:tcPr>
           <w:p>
             <w:pPr>
-              <w:pStyle w:val="ProgTableText"/>
+              <w:pStyle w:val="ProgTableMuted"/>
               <w:keepNext/>
             </w:pPr>
+            <w:r>
+              <w:t>Rattrapage, révision, TP supplémentaires</w:t>
+            </w:r>
           </w:p>
         </w:tc>
         <w:tc>
@@ -633,7 +636,7 @@
               <w:keepNext/>
             </w:pPr>
             <w:r>
-              <w:t>9 h</w:t>
+              <w:t>9 h</w:t>
             </w:r>
           </w:p>
         </w:tc>
@@ -697,7 +700,7 @@
               <w:keepNext/>
             </w:pPr>
             <w:r>
-              <w:t>81 h</w:t>
+              <w:t>81 h</w:t>
             </w:r>
           </w:p>
         </w:tc>
@@ -751,7 +754,7 @@
               <w:pStyle w:val="ProgTableText"/>
             </w:pPr>
             <w:r>
-              <w:t>Développeurs, administrateurs système et ingénieurs IT qui évoluent vers des rôles DevOps</w:t>
+              <w:t>Développeurs, administrateurs système et ingénieurs IT souhaitant évoluer vers des fonctions DevOps</w:t>
             </w:r>
           </w:p>
         </w:tc>
@@ -779,7 +782,7 @@
               <w:pStyle w:val="ProgTableText"/>
             </w:pPr>
             <w:r>
-              <w:t>Ligne de commande Linux et Bash (cours : Linux &amp; Bash Scripting) ; bases de Docker et Kubernetes (cours : Docker &amp; Kubernetes)</w:t>
+              <w:t>Ligne de commande Linux et Bash (cours : Linux &amp; Bash Scripting) ; bases de Docker et Kubernetes (cours : Docker &amp; Kubernetes). Ce cours prolonge Docker &amp; Kubernetes sans le répéter.</w:t>
             </w:r>
           </w:p>
         </w:tc>
@@ -807,7 +810,7 @@
               <w:pStyle w:val="ProgTableText"/>
             </w:pPr>
             <w:r>
-              <w:t>81 h : 72 h de chapitres + 9 h de marge, en 27 séances de 3 h</w:t>
+              <w:t>81 h : 72 h de chapitres + 9 h de réserve, en 27 séances de 3 h</w:t>
             </w:r>
           </w:p>
         </w:tc>
@@ -835,7 +838,35 @@
               <w:pStyle w:val="ProgTableText"/>
             </w:pPr>
             <w:r>
-              <w:t>Exposés courts suivis de labs guidés ; une même application reprise dans toutes les phases</w:t>
+              <w:t>Cours courts suivis de TP guidés ; une même application reprise dans toutes les phases</w:t>
+            </w:r>
+          </w:p>
+        </w:tc>
+      </w:tr>
+      <w:tr>
+        <w:tc>
+          <w:tcPr>
+            <w:tcW w:type="dxa" w:w="2381"/>
+          </w:tcPr>
+          <w:p>
+            <w:pPr>
+              <w:pStyle w:val="ProgTableKey"/>
+            </w:pPr>
+            <w:r>
+              <w:t>Environnement de TP</w:t>
+            </w:r>
+          </w:p>
+        </w:tc>
+        <w:tc>
+          <w:tcPr>
+            <w:tcW w:type="dxa" w:w="7257"/>
+          </w:tcPr>
+          <w:p>
+            <w:pPr>
+              <w:pStyle w:val="ProgTableText"/>
+            </w:pPr>
+            <w:r>
+              <w:t>Un ordinateur portable par participant (16 Go de RAM, Docker, VS Code) et un compte AWS de test par participant, fourni par l’organisateur</w:t>
             </w:r>
           </w:p>
         </w:tc>
@@ -863,7 +894,7 @@
               <w:pStyle w:val="ProgTableText"/>
             </w:pPr>
             <w:r>
-              <w:t>Labs validés à chaque phase et projet final présenté au groupe</w:t>
+              <w:t>Un TP validé à la fin de chaque phase et un projet final présenté au groupe ; attestation de formation pour les participants qui valident les deux</w:t>
             </w:r>
           </w:p>
         </w:tc>
@@ -891,7 +922,7 @@
               <w:pStyle w:val="ProgTableText"/>
             </w:pPr>
             <w:r>
-              <w:t>Les participants savent construire, contrôler la qualité, déployer et surveiller une application à travers une chaîne entièrement automatisée</w:t>
+              <w:t>Les participants savent faire passer une application du commit à la production via une chaîne automatisée : tests, seuils de qualité, artefacts versionnés, infrastructure en code, supervision et alertes</w:t>
             </w:r>
           </w:p>
         </w:tc>
@@ -918,7 +949,7 @@
       <w:r>
         <w:t>Phase 01</w:t>
         <w:tab/>
-        <w:t>12 h</w:t>
+        <w:t>9 h</w:t>
       </w:r>
     </w:p>
     <w:p>
@@ -926,7 +957,7 @@
         <w:pStyle w:val="Heading1"/>
       </w:pPr>
       <w:r>
-        <w:t>Culture DevOps &amp; collaboration</w:t>
+        <w:t>Culture DevOps et collaboration</w:t>
       </w:r>
     </w:p>
     <w:p>
@@ -934,7 +965,7 @@
         <w:pStyle w:val="ProgIntro"/>
       </w:pPr>
       <w:r>
-        <w:t>Le DevOps commence par la manière dont une équipe travaille, puis par la manière dont elle partage le code. Cette phase pose le vocabulaire et les indicateurs utilisés dans tout le programme, et rend chaque participant à l’aise avec Git et la collaboration par pull requests.</w:t>
+        <w:t>Le DevOps commence par la manière dont une équipe travaille, puis par la manière dont elle partage le code. Cette phase pose le vocabulaire et les indicateurs utilisés dans tout le programme, et permet à chaque participant de maîtriser Git et la collaboration par pull requests.</w:t>
       </w:r>
     </w:p>
     <w:tbl>
@@ -1056,7 +1087,7 @@
               <w:pStyle w:val="ProgTableText"/>
             </w:pPr>
             <w:r>
-              <w:t>CALMS, les quatre indicateurs DORA, Agile et Kanban, chaînes de valeur, où l’automatisation est rentable</w:t>
+              <w:t>CALMS, indicateurs DORA de performance de livraison, Agile et Kanban, cartographie de la chaîne de valeur, où l’automatisation est rentable</w:t>
             </w:r>
           </w:p>
         </w:tc>
@@ -1069,7 +1100,7 @@
               <w:pStyle w:val="ProgTableMuted"/>
             </w:pPr>
             <w:r>
-              <w:t>Exposé + atelier</w:t>
+              <w:t>Cours + atelier</w:t>
             </w:r>
           </w:p>
         </w:tc>
@@ -1082,7 +1113,7 @@
               <w:pStyle w:val="ProgTableHours"/>
             </w:pPr>
             <w:r>
-              <w:t>3 h</w:t>
+              <w:t>3 h</w:t>
             </w:r>
           </w:p>
         </w:tc>
@@ -1110,7 +1141,7 @@
               <w:pStyle w:val="ProgTableStrong"/>
             </w:pPr>
             <w:r>
-              <w:t>Fonctionnement interne de Git</w:t>
+              <w:t>Fondamentaux de Git</w:t>
             </w:r>
           </w:p>
         </w:tc>
@@ -1123,7 +1154,7 @@
               <w:pStyle w:val="ProgTableText"/>
             </w:pPr>
             <w:r>
-              <w:t>Pourquoi un gestionnaire de versions, distribué ou centralisé, blobs, arbres, commits et tags, le répertoire .git</w:t>
+              <w:t>Comment Git stocke l’historique (commits, arbres, références), init, clone, add, commit, log, diff, .gitignore, conventions de messages de commit</w:t>
             </w:r>
           </w:p>
         </w:tc>
@@ -1136,7 +1167,7 @@
               <w:pStyle w:val="ProgTableMuted"/>
             </w:pPr>
             <w:r>
-              <w:t>Exposé + lab</w:t>
+              <w:t>Cours + TP</w:t>
             </w:r>
           </w:p>
         </w:tc>
@@ -1149,7 +1180,7 @@
               <w:pStyle w:val="ProgTableHours"/>
             </w:pPr>
             <w:r>
-              <w:t>1,5 h</w:t>
+              <w:t>1,5 h</w:t>
             </w:r>
           </w:p>
         </w:tc>
@@ -1177,7 +1208,7 @@
               <w:pStyle w:val="ProgTableStrong"/>
             </w:pPr>
             <w:r>
-              <w:t>Flux de travail Git</w:t>
+              <w:t>Branches et fusions</w:t>
             </w:r>
           </w:p>
         </w:tc>
@@ -1190,7 +1221,7 @@
               <w:pStyle w:val="ProgTableText"/>
             </w:pPr>
             <w:r>
-              <w:t>init, clone, add, commit, status, log, diff, .gitignore, conventions de messages, commits atomiques</w:t>
+              <w:t>Modèle de branches, fusions fast-forward et à trois voies, rebase, cherry-pick, résolution de conflits</w:t>
             </w:r>
           </w:p>
         </w:tc>
@@ -1203,7 +1234,7 @@
               <w:pStyle w:val="ProgTableMuted"/>
             </w:pPr>
             <w:r>
-              <w:t>Exposé + lab</w:t>
+              <w:t>Cours + TP</w:t>
             </w:r>
           </w:p>
         </w:tc>
@@ -1216,7 +1247,7 @@
               <w:pStyle w:val="ProgTableHours"/>
             </w:pPr>
             <w:r>
-              <w:t>1,5 h</w:t>
+              <w:t>1,5 h</w:t>
             </w:r>
           </w:p>
         </w:tc>
@@ -1244,7 +1275,7 @@
               <w:pStyle w:val="ProgTableStrong"/>
             </w:pPr>
             <w:r>
-              <w:t>Branches &amp; fusions</w:t>
+              <w:t>Dépôts distants et pull requests</w:t>
             </w:r>
           </w:p>
         </w:tc>
@@ -1257,7 +1288,7 @@
               <w:pStyle w:val="ProgTableText"/>
             </w:pPr>
             <w:r>
-              <w:t>Modèle de branches, fusions fast-forward et à trois voies, rebase, cherry-pick, résolution de conflits</w:t>
+              <w:t>fetch, pull, push, authentification SSH ou HTTPS, forks, origin et upstream, pull requests et revue de code</w:t>
             </w:r>
           </w:p>
         </w:tc>
@@ -1270,7 +1301,7 @@
               <w:pStyle w:val="ProgTableMuted"/>
             </w:pPr>
             <w:r>
-              <w:t>Exposé + lab</w:t>
+              <w:t>Cours + TP</w:t>
             </w:r>
           </w:p>
         </w:tc>
@@ -1283,7 +1314,7 @@
               <w:pStyle w:val="ProgTableHours"/>
             </w:pPr>
             <w:r>
-              <w:t>1,5 h</w:t>
+              <w:t>1,5 h</w:t>
             </w:r>
           </w:p>
         </w:tc>
@@ -1311,7 +1342,7 @@
               <w:pStyle w:val="ProgTableStrong"/>
             </w:pPr>
             <w:r>
-              <w:t>Dépôts distants &amp; GitHub</w:t>
+              <w:t>Workflow Git en équipe</w:t>
             </w:r>
           </w:p>
         </w:tc>
@@ -1324,7 +1355,7 @@
               <w:pStyle w:val="ProgTableText"/>
             </w:pPr>
             <w:r>
-              <w:t>fetch, pull, push, authentification SSH ou HTTPS, forks, origin et upstream, pull requests</w:t>
+              <w:t>GitFlow ou trunk-based development, règles de protection des branches, tags de version, versionnage sémantique</w:t>
             </w:r>
           </w:p>
         </w:tc>
@@ -1337,7 +1368,7 @@
               <w:pStyle w:val="ProgTableMuted"/>
             </w:pPr>
             <w:r>
-              <w:t>Exposé + lab</w:t>
+              <w:t>Cours + TP</w:t>
             </w:r>
           </w:p>
         </w:tc>
@@ -1350,74 +1381,7 @@
               <w:pStyle w:val="ProgTableHours"/>
             </w:pPr>
             <w:r>
-              <w:t>1,5 h</w:t>
-            </w:r>
-          </w:p>
-        </w:tc>
-      </w:tr>
-      <w:tr>
-        <w:tc>
-          <w:tcPr>
-            <w:tcW w:type="dxa" w:w="567"/>
-          </w:tcPr>
-          <w:p>
-            <w:pPr>
-              <w:pStyle w:val="ProgTableId"/>
-            </w:pPr>
-            <w:r>
-              <w:t>1.6</w:t>
-            </w:r>
-          </w:p>
-        </w:tc>
-        <w:tc>
-          <w:tcPr>
-            <w:tcW w:type="dxa" w:w="2211"/>
-          </w:tcPr>
-          <w:p>
-            <w:pPr>
-              <w:pStyle w:val="ProgTableStrong"/>
-            </w:pPr>
-            <w:r>
-              <w:t>Travail en équipe</w:t>
-            </w:r>
-          </w:p>
-        </w:tc>
-        <w:tc>
-          <w:tcPr>
-            <w:tcW w:type="dxa" w:w="4876"/>
-          </w:tcPr>
-          <w:p>
-            <w:pPr>
-              <w:pStyle w:val="ProgTableText"/>
-            </w:pPr>
-            <w:r>
-              <w:t>GitFlow ou trunk-based, revue de code, règles de protection des branches, tags de version, versionnage sémantique</w:t>
-            </w:r>
-          </w:p>
-        </w:tc>
-        <w:tc>
-          <w:tcPr>
-            <w:tcW w:type="dxa" w:w="1134"/>
-          </w:tcPr>
-          <w:p>
-            <w:pPr>
-              <w:pStyle w:val="ProgTableMuted"/>
-            </w:pPr>
-            <w:r>
-              <w:t>Exposé + lab</w:t>
-            </w:r>
-          </w:p>
-        </w:tc>
-        <w:tc>
-          <w:tcPr>
-            <w:tcW w:type="dxa" w:w="850"/>
-          </w:tcPr>
-          <w:p>
-            <w:pPr>
-              <w:pStyle w:val="ProgTableHours"/>
-            </w:pPr>
-            <w:r>
-              <w:t>3 h</w:t>
+              <w:t>1,5 h</w:t>
             </w:r>
           </w:p>
         </w:tc>
@@ -1444,7 +1408,7 @@
       <w:r>
         <w:t>Phase 02</w:t>
         <w:tab/>
-        <w:t>21 h</w:t>
+        <w:t>24 h</w:t>
       </w:r>
     </w:p>
     <w:p>
@@ -1452,7 +1416,7 @@
         <w:pStyle w:val="Heading1"/>
       </w:pPr>
       <w:r>
-        <w:t>Intégration &amp; livraison continues</w:t>
+        <w:t>Intégration et livraison continues</w:t>
       </w:r>
     </w:p>
     <w:p>
@@ -1460,7 +1424,7 @@
         <w:pStyle w:val="ProgIntro"/>
       </w:pPr>
       <w:r>
-        <w:t>Les participants construisent le même pipeline deux fois : sur un serveur Jenkins auto-hébergé, comme la plupart des entreprises en interne, et sur GitHub Actions, comme la plupart des équipes cloud. Des barrières de qualité et la gestion des artefacts garantissent que seules des versions testées et numérotées avancent.</w:t>
+        <w:t>Les participants construisent le même pipeline deux fois : sur Jenkins, le serveur d’intégration continue auto-hébergé le plus répandu, et sur GitHub Actions. Tests, seuils de qualité et dépôt d’artefacts garantissent que seules des versions testées et versionnées sont déployées, et la phase se termine par les stratégies de mise en production qui rendent un déploiement réversible.</w:t>
       </w:r>
     </w:p>
     <w:tbl>
@@ -1582,7 +1546,7 @@
               <w:pStyle w:val="ProgTableText"/>
             </w:pPr>
             <w:r>
-              <w:t>Installation, plugins, paramètres de sécurité, architecture contrôleur et agents, types de jobs</w:t>
+              <w:t>Installation, plugins, paramètres de sécurité, contrôleur et agents, types de jobs</w:t>
             </w:r>
           </w:p>
         </w:tc>
@@ -1595,7 +1559,7 @@
               <w:pStyle w:val="ProgTableMuted"/>
             </w:pPr>
             <w:r>
-              <w:t>Exposé + lab</w:t>
+              <w:t>Cours + TP</w:t>
             </w:r>
           </w:p>
         </w:tc>
@@ -1608,7 +1572,7 @@
               <w:pStyle w:val="ProgTableHours"/>
             </w:pPr>
             <w:r>
-              <w:t>1,5 h</w:t>
+              <w:t>1,5 h</w:t>
             </w:r>
           </w:p>
         </w:tc>
@@ -1636,7 +1600,7 @@
               <w:pStyle w:val="ProgTableStrong"/>
             </w:pPr>
             <w:r>
-              <w:t>Pipelines Jenkins</w:t>
+              <w:t>Déclencheurs et identifiants</w:t>
             </w:r>
           </w:p>
         </w:tc>
@@ -1649,7 +1613,7 @@
               <w:pStyle w:val="ProgTableText"/>
             </w:pPr>
             <w:r>
-              <w:t>Pipelines déclaratifs, stages et steps, actions post, paramètres, variables d’environnement</w:t>
+              <w:t>Webhooks, scrutation du dépôt, builds planifiés, types d’identifiants et usage sécurisé</w:t>
             </w:r>
           </w:p>
         </w:tc>
@@ -1662,7 +1626,7 @@
               <w:pStyle w:val="ProgTableMuted"/>
             </w:pPr>
             <w:r>
-              <w:t>Exposé + lab</w:t>
+              <w:t>Cours + TP</w:t>
             </w:r>
           </w:p>
         </w:tc>
@@ -1675,7 +1639,7 @@
               <w:pStyle w:val="ProgTableHours"/>
             </w:pPr>
             <w:r>
-              <w:t>3 h</w:t>
+              <w:t>1,5 h</w:t>
             </w:r>
           </w:p>
         </w:tc>
@@ -1703,7 +1667,7 @@
               <w:pStyle w:val="ProgTableStrong"/>
             </w:pPr>
             <w:r>
-              <w:t>Déclencheurs &amp; identifiants</w:t>
+              <w:t>Pipelines Jenkins</w:t>
             </w:r>
           </w:p>
         </w:tc>
@@ -1716,7 +1680,7 @@
               <w:pStyle w:val="ProgTableText"/>
             </w:pPr>
             <w:r>
-              <w:t>Webhooks, scrutation SCM, builds planifiés, types d’identifiants et usage sécurisé dans les pipelines</w:t>
+              <w:t>Jenkinsfile déclaratif, stages et steps, actions post, paramètres, variables d’environnement</w:t>
             </w:r>
           </w:p>
         </w:tc>
@@ -1729,7 +1693,7 @@
               <w:pStyle w:val="ProgTableMuted"/>
             </w:pPr>
             <w:r>
-              <w:t>Exposé + lab</w:t>
+              <w:t>Cours + TP</w:t>
             </w:r>
           </w:p>
         </w:tc>
@@ -1742,7 +1706,7 @@
               <w:pStyle w:val="ProgTableHours"/>
             </w:pPr>
             <w:r>
-              <w:t>1,5 h</w:t>
+              <w:t>3 h</w:t>
             </w:r>
           </w:p>
         </w:tc>
@@ -1796,7 +1760,7 @@
               <w:pStyle w:val="ProgTableMuted"/>
             </w:pPr>
             <w:r>
-              <w:t>Exposé + lab</w:t>
+              <w:t>Cours + TP</w:t>
             </w:r>
           </w:p>
         </w:tc>
@@ -1809,7 +1773,7 @@
               <w:pStyle w:val="ProgTableHours"/>
             </w:pPr>
             <w:r>
-              <w:t>1,5 h</w:t>
+              <w:t>1,5 h</w:t>
             </w:r>
           </w:p>
         </w:tc>
@@ -1837,7 +1801,7 @@
               <w:pStyle w:val="ProgTableStrong"/>
             </w:pPr>
             <w:r>
-              <w:t>Déployer depuis Jenkins</w:t>
+              <w:t>Tests automatisés dans le pipeline</w:t>
             </w:r>
           </w:p>
         </w:tc>
@@ -1850,7 +1814,7 @@
               <w:pStyle w:val="ProgTableText"/>
             </w:pPr>
             <w:r>
-              <w:t>Construire et publier des images de conteneurs, déployer sur Kubernetes, archiver les artefacts</w:t>
+              <w:t>Étapes de tests unitaires et d’intégration, rapports JUnit, arrêt au premier échec, environnements de test jetables en conteneurs</w:t>
             </w:r>
           </w:p>
         </w:tc>
@@ -1863,7 +1827,7 @@
               <w:pStyle w:val="ProgTableMuted"/>
             </w:pPr>
             <w:r>
-              <w:t>Lab</w:t>
+              <w:t>Cours + TP</w:t>
             </w:r>
           </w:p>
         </w:tc>
@@ -1876,7 +1840,7 @@
               <w:pStyle w:val="ProgTableHours"/>
             </w:pPr>
             <w:r>
-              <w:t>1,5 h</w:t>
+              <w:t>1,5 h</w:t>
             </w:r>
           </w:p>
         </w:tc>
@@ -1892,6 +1856,274 @@
             </w:pPr>
             <w:r>
               <w:t>2.6</w:t>
+            </w:r>
+          </w:p>
+        </w:tc>
+        <w:tc>
+          <w:tcPr>
+            <w:tcW w:type="dxa" w:w="2211"/>
+          </w:tcPr>
+          <w:p>
+            <w:pPr>
+              <w:pStyle w:val="ProgTableStrong"/>
+            </w:pPr>
+            <w:r>
+              <w:t>Qualité du code avec SonarQube</w:t>
+            </w:r>
+          </w:p>
+        </w:tc>
+        <w:tc>
+          <w:tcPr>
+            <w:tcW w:type="dxa" w:w="4876"/>
+          </w:tcPr>
+          <w:p>
+            <w:pPr>
+              <w:pStyle w:val="ProgTableText"/>
+            </w:pPr>
+            <w:r>
+              <w:t>Analyse statique, import de la couverture, profils qualité, seuils de qualité qui arrêtent le pipeline</w:t>
+            </w:r>
+          </w:p>
+        </w:tc>
+        <w:tc>
+          <w:tcPr>
+            <w:tcW w:type="dxa" w:w="1134"/>
+          </w:tcPr>
+          <w:p>
+            <w:pPr>
+              <w:pStyle w:val="ProgTableMuted"/>
+            </w:pPr>
+            <w:r>
+              <w:t>Cours + TP</w:t>
+            </w:r>
+          </w:p>
+        </w:tc>
+        <w:tc>
+          <w:tcPr>
+            <w:tcW w:type="dxa" w:w="850"/>
+          </w:tcPr>
+          <w:p>
+            <w:pPr>
+              <w:pStyle w:val="ProgTableHours"/>
+            </w:pPr>
+            <w:r>
+              <w:t>3 h</w:t>
+            </w:r>
+          </w:p>
+        </w:tc>
+      </w:tr>
+      <w:tr>
+        <w:tc>
+          <w:tcPr>
+            <w:tcW w:type="dxa" w:w="567"/>
+          </w:tcPr>
+          <w:p>
+            <w:pPr>
+              <w:pStyle w:val="ProgTableId"/>
+            </w:pPr>
+            <w:r>
+              <w:t>2.7</w:t>
+            </w:r>
+          </w:p>
+        </w:tc>
+        <w:tc>
+          <w:tcPr>
+            <w:tcW w:type="dxa" w:w="2211"/>
+          </w:tcPr>
+          <w:p>
+            <w:pPr>
+              <w:pStyle w:val="ProgTableStrong"/>
+            </w:pPr>
+            <w:r>
+              <w:t>Gestion des artefacts avec Nexus</w:t>
+            </w:r>
+          </w:p>
+        </w:tc>
+        <w:tc>
+          <w:tcPr>
+            <w:tcW w:type="dxa" w:w="4876"/>
+          </w:tcPr>
+          <w:p>
+            <w:pPr>
+              <w:pStyle w:val="ProgTableText"/>
+            </w:pPr>
+            <w:r>
+              <w:t>Dépôts hosted, proxy et group, Nexus comme registre Docker, versionnage, politiques de nettoyage, publication depuis le pipeline</w:t>
+            </w:r>
+          </w:p>
+        </w:tc>
+        <w:tc>
+          <w:tcPr>
+            <w:tcW w:type="dxa" w:w="1134"/>
+          </w:tcPr>
+          <w:p>
+            <w:pPr>
+              <w:pStyle w:val="ProgTableMuted"/>
+            </w:pPr>
+            <w:r>
+              <w:t>Cours + TP</w:t>
+            </w:r>
+          </w:p>
+        </w:tc>
+        <w:tc>
+          <w:tcPr>
+            <w:tcW w:type="dxa" w:w="850"/>
+          </w:tcPr>
+          <w:p>
+            <w:pPr>
+              <w:pStyle w:val="ProgTableHours"/>
+            </w:pPr>
+            <w:r>
+              <w:t>3 h</w:t>
+            </w:r>
+          </w:p>
+        </w:tc>
+      </w:tr>
+      <w:tr>
+        <w:tc>
+          <w:tcPr>
+            <w:tcW w:type="dxa" w:w="567"/>
+          </w:tcPr>
+          <w:p>
+            <w:pPr>
+              <w:pStyle w:val="ProgTableId"/>
+            </w:pPr>
+            <w:r>
+              <w:t>2.8</w:t>
+            </w:r>
+          </w:p>
+        </w:tc>
+        <w:tc>
+          <w:tcPr>
+            <w:tcW w:type="dxa" w:w="2211"/>
+          </w:tcPr>
+          <w:p>
+            <w:pPr>
+              <w:pStyle w:val="ProgTableStrong"/>
+            </w:pPr>
+            <w:r>
+              <w:t>Déployer depuis Jenkins</w:t>
+            </w:r>
+          </w:p>
+        </w:tc>
+        <w:tc>
+          <w:tcPr>
+            <w:tcW w:type="dxa" w:w="4876"/>
+          </w:tcPr>
+          <w:p>
+            <w:pPr>
+              <w:pStyle w:val="ProgTableText"/>
+            </w:pPr>
+            <w:r>
+              <w:t>Construire, étiqueter et publier les images dans Nexus, déployer sur Kubernetes avec Helm, promotion entre environnements</w:t>
+            </w:r>
+          </w:p>
+        </w:tc>
+        <w:tc>
+          <w:tcPr>
+            <w:tcW w:type="dxa" w:w="1134"/>
+          </w:tcPr>
+          <w:p>
+            <w:pPr>
+              <w:pStyle w:val="ProgTableMuted"/>
+            </w:pPr>
+            <w:r>
+              <w:t>TP</w:t>
+            </w:r>
+          </w:p>
+        </w:tc>
+        <w:tc>
+          <w:tcPr>
+            <w:tcW w:type="dxa" w:w="850"/>
+          </w:tcPr>
+          <w:p>
+            <w:pPr>
+              <w:pStyle w:val="ProgTableHours"/>
+            </w:pPr>
+            <w:r>
+              <w:t>1,5 h</w:t>
+            </w:r>
+          </w:p>
+        </w:tc>
+      </w:tr>
+      <w:tr>
+        <w:tc>
+          <w:tcPr>
+            <w:tcW w:type="dxa" w:w="567"/>
+          </w:tcPr>
+          <w:p>
+            <w:pPr>
+              <w:pStyle w:val="ProgTableId"/>
+            </w:pPr>
+            <w:r>
+              <w:t>2.9</w:t>
+            </w:r>
+          </w:p>
+        </w:tc>
+        <w:tc>
+          <w:tcPr>
+            <w:tcW w:type="dxa" w:w="2211"/>
+          </w:tcPr>
+          <w:p>
+            <w:pPr>
+              <w:pStyle w:val="ProgTableStrong"/>
+            </w:pPr>
+            <w:r>
+              <w:t>Stratégies de déploiement et retour arrière</w:t>
+            </w:r>
+          </w:p>
+        </w:tc>
+        <w:tc>
+          <w:tcPr>
+            <w:tcW w:type="dxa" w:w="4876"/>
+          </w:tcPr>
+          <w:p>
+            <w:pPr>
+              <w:pStyle w:val="ProgTableText"/>
+            </w:pPr>
+            <w:r>
+              <w:t>Déploiements progressifs, blue/green et canary, retour arrière, feature flags ; déploiement poussé ou GitOps (Argo CD, vu dans Docker &amp; Kubernetes)</w:t>
+            </w:r>
+          </w:p>
+        </w:tc>
+        <w:tc>
+          <w:tcPr>
+            <w:tcW w:type="dxa" w:w="1134"/>
+          </w:tcPr>
+          <w:p>
+            <w:pPr>
+              <w:pStyle w:val="ProgTableMuted"/>
+            </w:pPr>
+            <w:r>
+              <w:t>Cours + TP</w:t>
+            </w:r>
+          </w:p>
+        </w:tc>
+        <w:tc>
+          <w:tcPr>
+            <w:tcW w:type="dxa" w:w="850"/>
+          </w:tcPr>
+          <w:p>
+            <w:pPr>
+              <w:pStyle w:val="ProgTableHours"/>
+            </w:pPr>
+            <w:r>
+              <w:t>1,5 h</w:t>
+            </w:r>
+          </w:p>
+        </w:tc>
+      </w:tr>
+      <w:tr>
+        <w:tc>
+          <w:tcPr>
+            <w:tcW w:type="dxa" w:w="567"/>
+          </w:tcPr>
+          <w:p>
+            <w:pPr>
+              <w:pStyle w:val="ProgTableId"/>
+            </w:pPr>
+            <w:r>
+              <w:t>2.10</w:t>
             </w:r>
           </w:p>
         </w:tc>
@@ -1930,7 +2162,7 @@
               <w:pStyle w:val="ProgTableMuted"/>
             </w:pPr>
             <w:r>
-              <w:t>Exposé + lab</w:t>
+              <w:t>Cours + TP</w:t>
             </w:r>
           </w:p>
         </w:tc>
@@ -1943,7 +2175,7 @@
               <w:pStyle w:val="ProgTableHours"/>
             </w:pPr>
             <w:r>
-              <w:t>3 h</w:t>
+              <w:t>3 h</w:t>
             </w:r>
           </w:p>
         </w:tc>
@@ -1958,7 +2190,7 @@
               <w:pStyle w:val="ProgTableId"/>
             </w:pPr>
             <w:r>
-              <w:t>2.7</w:t>
+              <w:t>2.11</w:t>
             </w:r>
           </w:p>
         </w:tc>
@@ -1984,7 +2216,7 @@
               <w:pStyle w:val="ProgTableText"/>
             </w:pPr>
             <w:r>
-              <w:t>Secrets, environnements et approbations, fédération OIDC vers le cloud, workflows de déploiement</w:t>
+              <w:t>Secrets, environnements et validations obligatoires, fédération OIDC vers AWS sans clés permanentes, workflows réutilisables, déploiement</w:t>
             </w:r>
           </w:p>
         </w:tc>
@@ -1997,7 +2229,7 @@
               <w:pStyle w:val="ProgTableMuted"/>
             </w:pPr>
             <w:r>
-              <w:t>Exposé + lab</w:t>
+              <w:t>Cours + TP</w:t>
             </w:r>
           </w:p>
         </w:tc>
@@ -2010,141 +2242,7 @@
               <w:pStyle w:val="ProgTableHours"/>
             </w:pPr>
             <w:r>
-              <w:t>3 h</w:t>
-            </w:r>
-          </w:p>
-        </w:tc>
-      </w:tr>
-      <w:tr>
-        <w:tc>
-          <w:tcPr>
-            <w:tcW w:type="dxa" w:w="567"/>
-          </w:tcPr>
-          <w:p>
-            <w:pPr>
-              <w:pStyle w:val="ProgTableId"/>
-            </w:pPr>
-            <w:r>
-              <w:t>2.8</w:t>
-            </w:r>
-          </w:p>
-        </w:tc>
-        <w:tc>
-          <w:tcPr>
-            <w:tcW w:type="dxa" w:w="2211"/>
-          </w:tcPr>
-          <w:p>
-            <w:pPr>
-              <w:pStyle w:val="ProgTableStrong"/>
-            </w:pPr>
-            <w:r>
-              <w:t>Qualité du code avec SonarQube</w:t>
-            </w:r>
-          </w:p>
-        </w:tc>
-        <w:tc>
-          <w:tcPr>
-            <w:tcW w:type="dxa" w:w="4876"/>
-          </w:tcPr>
-          <w:p>
-            <w:pPr>
-              <w:pStyle w:val="ProgTableText"/>
-            </w:pPr>
-            <w:r>
-              <w:t>Analyse statique, rapports de couverture, profils qualité, barrières de qualité qui bloquent un pipeline</w:t>
-            </w:r>
-          </w:p>
-        </w:tc>
-        <w:tc>
-          <w:tcPr>
-            <w:tcW w:type="dxa" w:w="1134"/>
-          </w:tcPr>
-          <w:p>
-            <w:pPr>
-              <w:pStyle w:val="ProgTableMuted"/>
-            </w:pPr>
-            <w:r>
-              <w:t>Exposé + lab</w:t>
-            </w:r>
-          </w:p>
-        </w:tc>
-        <w:tc>
-          <w:tcPr>
-            <w:tcW w:type="dxa" w:w="850"/>
-          </w:tcPr>
-          <w:p>
-            <w:pPr>
-              <w:pStyle w:val="ProgTableHours"/>
-            </w:pPr>
-            <w:r>
-              <w:t>3 h</w:t>
-            </w:r>
-          </w:p>
-        </w:tc>
-      </w:tr>
-      <w:tr>
-        <w:tc>
-          <w:tcPr>
-            <w:tcW w:type="dxa" w:w="567"/>
-          </w:tcPr>
-          <w:p>
-            <w:pPr>
-              <w:pStyle w:val="ProgTableId"/>
-            </w:pPr>
-            <w:r>
-              <w:t>2.9</w:t>
-            </w:r>
-          </w:p>
-        </w:tc>
-        <w:tc>
-          <w:tcPr>
-            <w:tcW w:type="dxa" w:w="2211"/>
-          </w:tcPr>
-          <w:p>
-            <w:pPr>
-              <w:pStyle w:val="ProgTableStrong"/>
-            </w:pPr>
-            <w:r>
-              <w:t>Gestion des artefacts avec Nexus</w:t>
-            </w:r>
-          </w:p>
-        </w:tc>
-        <w:tc>
-          <w:tcPr>
-            <w:tcW w:type="dxa" w:w="4876"/>
-          </w:tcPr>
-          <w:p>
-            <w:pPr>
-              <w:pStyle w:val="ProgTableText"/>
-            </w:pPr>
-            <w:r>
-              <w:t>Dépôts hosted, proxy et group, versionnage, politiques de rétention, publication depuis le pipeline</w:t>
-            </w:r>
-          </w:p>
-        </w:tc>
-        <w:tc>
-          <w:tcPr>
-            <w:tcW w:type="dxa" w:w="1134"/>
-          </w:tcPr>
-          <w:p>
-            <w:pPr>
-              <w:pStyle w:val="ProgTableMuted"/>
-            </w:pPr>
-            <w:r>
-              <w:t>Exposé + lab</w:t>
-            </w:r>
-          </w:p>
-        </w:tc>
-        <w:tc>
-          <w:tcPr>
-            <w:tcW w:type="dxa" w:w="850"/>
-          </w:tcPr>
-          <w:p>
-            <w:pPr>
-              <w:pStyle w:val="ProgTableHours"/>
-            </w:pPr>
-            <w:r>
-              <w:t>3 h</w:t>
+              <w:t>3 h</w:t>
             </w:r>
           </w:p>
         </w:tc>
@@ -2171,7 +2269,7 @@
       <w:r>
         <w:t>Phase 03</w:t>
         <w:tab/>
-        <w:t>24 h</w:t>
+        <w:t>24 h</w:t>
       </w:r>
     </w:p>
     <w:p>
@@ -2187,7 +2285,7 @@
         <w:pStyle w:val="ProgIntro"/>
       </w:pPr>
       <w:r>
-        <w:t>Serveurs et ressources cloud sont décrits en code, relus comme du code et appliqués par le pipeline. Ansible configure les machines ; Terraform crée l’infrastructure sur laquelle elles tournent. Chaque outil se termine par un petit projet que le projet final réutilise.</w:t>
+        <w:t>L’infrastructure est décrite sous forme de code, relue comme du code et appliquée par le pipeline. Terraform crée l’environnement AWS de l’application du cours ; Ansible configure ensuite les serveurs qui hébergent les outils de l’équipe. Chaque outil se termine par un projet que le projet final réutilise.</w:t>
       </w:r>
     </w:p>
     <w:tbl>
@@ -2296,7 +2394,7 @@
               <w:pStyle w:val="ProgTableStrong"/>
             </w:pPr>
             <w:r>
-              <w:t>IaC &amp; bases d’Ansible</w:t>
+              <w:t>Bases de Terraform</w:t>
             </w:r>
           </w:p>
         </w:tc>
@@ -2309,7 +2407,7 @@
               <w:pStyle w:val="ProgTableText"/>
             </w:pPr>
             <w:r>
-              <w:t>Déclaratif ou impératif, dérive de configuration, architecture d’Ansible, inventaire statique, commandes ad hoc</w:t>
+              <w:t>Providers, HCL, ressources, data sources, graphe de dépendances, init, plan et apply, fmt et validate</w:t>
             </w:r>
           </w:p>
         </w:tc>
@@ -2322,7 +2420,7 @@
               <w:pStyle w:val="ProgTableMuted"/>
             </w:pPr>
             <w:r>
-              <w:t>Exposé + lab</w:t>
+              <w:t>Cours + TP</w:t>
             </w:r>
           </w:p>
         </w:tc>
@@ -2335,7 +2433,7 @@
               <w:pStyle w:val="ProgTableHours"/>
             </w:pPr>
             <w:r>
-              <w:t>3 h</w:t>
+              <w:t>3 h</w:t>
             </w:r>
           </w:p>
         </w:tc>
@@ -2363,7 +2461,7 @@
               <w:pStyle w:val="ProgTableStrong"/>
             </w:pPr>
             <w:r>
-              <w:t>Playbooks</w:t>
+              <w:t>État et variables</w:t>
             </w:r>
           </w:p>
         </w:tc>
@@ -2376,7 +2474,7 @@
               <w:pStyle w:val="ProgTableText"/>
             </w:pPr>
             <w:r>
-              <w:t>YAML, plays et tâches, modules principaux, handlers, conditions, idempotence</w:t>
+              <w:t>Variables et validation, outputs, état et commandes terraform state, backend distant S3 et verrouillage, HCP Terraform</w:t>
             </w:r>
           </w:p>
         </w:tc>
@@ -2389,7 +2487,7 @@
               <w:pStyle w:val="ProgTableMuted"/>
             </w:pPr>
             <w:r>
-              <w:t>Exposé + lab</w:t>
+              <w:t>Cours + TP</w:t>
             </w:r>
           </w:p>
         </w:tc>
@@ -2402,7 +2500,7 @@
               <w:pStyle w:val="ProgTableHours"/>
             </w:pPr>
             <w:r>
-              <w:t>3 h</w:t>
+              <w:t>3 h</w:t>
             </w:r>
           </w:p>
         </w:tc>
@@ -2430,7 +2528,7 @@
               <w:pStyle w:val="ProgTableStrong"/>
             </w:pPr>
             <w:r>
-              <w:t>Variables, templates &amp; Vault</w:t>
+              <w:t>Modules et environnements</w:t>
             </w:r>
           </w:p>
         </w:tc>
@@ -2443,7 +2541,7 @@
               <w:pStyle w:val="ProgTableText"/>
             </w:pPr>
             <w:r>
-              <w:t>group_vars et host_vars, templates et filtres Jinja2, Ansible Vault pour les secrets</w:t>
+              <w:t>Écrire et versionner des modules, Terraform Registry, workspaces, règles lifecycle, blocs import et moved, organisation du code</w:t>
             </w:r>
           </w:p>
         </w:tc>
@@ -2456,7 +2554,7 @@
               <w:pStyle w:val="ProgTableMuted"/>
             </w:pPr>
             <w:r>
-              <w:t>Exposé + lab</w:t>
+              <w:t>Cours + TP</w:t>
             </w:r>
           </w:p>
         </w:tc>
@@ -2469,7 +2567,7 @@
               <w:pStyle w:val="ProgTableHours"/>
             </w:pPr>
             <w:r>
-              <w:t>1,5 h</w:t>
+              <w:t>3 h</w:t>
             </w:r>
           </w:p>
         </w:tc>
@@ -2485,6 +2583,274 @@
             </w:pPr>
             <w:r>
               <w:t>3.4</w:t>
+            </w:r>
+          </w:p>
+        </w:tc>
+        <w:tc>
+          <w:tcPr>
+            <w:tcW w:type="dxa" w:w="2211"/>
+          </w:tcPr>
+          <w:p>
+            <w:pPr>
+              <w:pStyle w:val="ProgTableStrong"/>
+            </w:pPr>
+            <w:r>
+              <w:t>Projet Terraform</w:t>
+            </w:r>
+          </w:p>
+        </w:tc>
+        <w:tc>
+          <w:tcPr>
+            <w:tcW w:type="dxa" w:w="4876"/>
+          </w:tcPr>
+          <w:p>
+            <w:pPr>
+              <w:pStyle w:val="ProgTableText"/>
+            </w:pPr>
+            <w:r>
+              <w:t>Provisionner l’environnement du cours sur AWS : VPC, cluster EKS, base de données RDS et serveurs EC2 pour les outils</w:t>
+            </w:r>
+          </w:p>
+        </w:tc>
+        <w:tc>
+          <w:tcPr>
+            <w:tcW w:type="dxa" w:w="1134"/>
+          </w:tcPr>
+          <w:p>
+            <w:pPr>
+              <w:pStyle w:val="ProgTableMuted"/>
+            </w:pPr>
+            <w:r>
+              <w:t>TP</w:t>
+            </w:r>
+          </w:p>
+        </w:tc>
+        <w:tc>
+          <w:tcPr>
+            <w:tcW w:type="dxa" w:w="850"/>
+          </w:tcPr>
+          <w:p>
+            <w:pPr>
+              <w:pStyle w:val="ProgTableHours"/>
+            </w:pPr>
+            <w:r>
+              <w:t>3 h</w:t>
+            </w:r>
+          </w:p>
+        </w:tc>
+      </w:tr>
+      <w:tr>
+        <w:tc>
+          <w:tcPr>
+            <w:tcW w:type="dxa" w:w="567"/>
+          </w:tcPr>
+          <w:p>
+            <w:pPr>
+              <w:pStyle w:val="ProgTableId"/>
+            </w:pPr>
+            <w:r>
+              <w:t>3.5</w:t>
+            </w:r>
+          </w:p>
+        </w:tc>
+        <w:tc>
+          <w:tcPr>
+            <w:tcW w:type="dxa" w:w="2211"/>
+          </w:tcPr>
+          <w:p>
+            <w:pPr>
+              <w:pStyle w:val="ProgTableStrong"/>
+            </w:pPr>
+            <w:r>
+              <w:t>Bases d’Ansible</w:t>
+            </w:r>
+          </w:p>
+        </w:tc>
+        <w:tc>
+          <w:tcPr>
+            <w:tcW w:type="dxa" w:w="4876"/>
+          </w:tcPr>
+          <w:p>
+            <w:pPr>
+              <w:pStyle w:val="ProgTableText"/>
+            </w:pPr>
+            <w:r>
+              <w:t>Déclaratif ou impératif, dérive de configuration, architecture, inventaires statiques et dynamiques AWS, commandes ad hoc</w:t>
+            </w:r>
+          </w:p>
+        </w:tc>
+        <w:tc>
+          <w:tcPr>
+            <w:tcW w:type="dxa" w:w="1134"/>
+          </w:tcPr>
+          <w:p>
+            <w:pPr>
+              <w:pStyle w:val="ProgTableMuted"/>
+            </w:pPr>
+            <w:r>
+              <w:t>Cours + TP</w:t>
+            </w:r>
+          </w:p>
+        </w:tc>
+        <w:tc>
+          <w:tcPr>
+            <w:tcW w:type="dxa" w:w="850"/>
+          </w:tcPr>
+          <w:p>
+            <w:pPr>
+              <w:pStyle w:val="ProgTableHours"/>
+            </w:pPr>
+            <w:r>
+              <w:t>3 h</w:t>
+            </w:r>
+          </w:p>
+        </w:tc>
+      </w:tr>
+      <w:tr>
+        <w:tc>
+          <w:tcPr>
+            <w:tcW w:type="dxa" w:w="567"/>
+          </w:tcPr>
+          <w:p>
+            <w:pPr>
+              <w:pStyle w:val="ProgTableId"/>
+            </w:pPr>
+            <w:r>
+              <w:t>3.6</w:t>
+            </w:r>
+          </w:p>
+        </w:tc>
+        <w:tc>
+          <w:tcPr>
+            <w:tcW w:type="dxa" w:w="2211"/>
+          </w:tcPr>
+          <w:p>
+            <w:pPr>
+              <w:pStyle w:val="ProgTableStrong"/>
+            </w:pPr>
+            <w:r>
+              <w:t>Playbooks</w:t>
+            </w:r>
+          </w:p>
+        </w:tc>
+        <w:tc>
+          <w:tcPr>
+            <w:tcW w:type="dxa" w:w="4876"/>
+          </w:tcPr>
+          <w:p>
+            <w:pPr>
+              <w:pStyle w:val="ProgTableText"/>
+            </w:pPr>
+            <w:r>
+              <w:t>YAML, plays et tâches, modules principaux, handlers, conditions, boucles, idempotence</w:t>
+            </w:r>
+          </w:p>
+        </w:tc>
+        <w:tc>
+          <w:tcPr>
+            <w:tcW w:type="dxa" w:w="1134"/>
+          </w:tcPr>
+          <w:p>
+            <w:pPr>
+              <w:pStyle w:val="ProgTableMuted"/>
+            </w:pPr>
+            <w:r>
+              <w:t>Cours + TP</w:t>
+            </w:r>
+          </w:p>
+        </w:tc>
+        <w:tc>
+          <w:tcPr>
+            <w:tcW w:type="dxa" w:w="850"/>
+          </w:tcPr>
+          <w:p>
+            <w:pPr>
+              <w:pStyle w:val="ProgTableHours"/>
+            </w:pPr>
+            <w:r>
+              <w:t>3 h</w:t>
+            </w:r>
+          </w:p>
+        </w:tc>
+      </w:tr>
+      <w:tr>
+        <w:tc>
+          <w:tcPr>
+            <w:tcW w:type="dxa" w:w="567"/>
+          </w:tcPr>
+          <w:p>
+            <w:pPr>
+              <w:pStyle w:val="ProgTableId"/>
+            </w:pPr>
+            <w:r>
+              <w:t>3.7</w:t>
+            </w:r>
+          </w:p>
+        </w:tc>
+        <w:tc>
+          <w:tcPr>
+            <w:tcW w:type="dxa" w:w="2211"/>
+          </w:tcPr>
+          <w:p>
+            <w:pPr>
+              <w:pStyle w:val="ProgTableStrong"/>
+            </w:pPr>
+            <w:r>
+              <w:t>Variables, templates et Vault</w:t>
+            </w:r>
+          </w:p>
+        </w:tc>
+        <w:tc>
+          <w:tcPr>
+            <w:tcW w:type="dxa" w:w="4876"/>
+          </w:tcPr>
+          <w:p>
+            <w:pPr>
+              <w:pStyle w:val="ProgTableText"/>
+            </w:pPr>
+            <w:r>
+              <w:t>group_vars et host_vars, facts, templates et filtres Jinja2, Ansible Vault pour les secrets</w:t>
+            </w:r>
+          </w:p>
+        </w:tc>
+        <w:tc>
+          <w:tcPr>
+            <w:tcW w:type="dxa" w:w="1134"/>
+          </w:tcPr>
+          <w:p>
+            <w:pPr>
+              <w:pStyle w:val="ProgTableMuted"/>
+            </w:pPr>
+            <w:r>
+              <w:t>Cours + TP</w:t>
+            </w:r>
+          </w:p>
+        </w:tc>
+        <w:tc>
+          <w:tcPr>
+            <w:tcW w:type="dxa" w:w="850"/>
+          </w:tcPr>
+          <w:p>
+            <w:pPr>
+              <w:pStyle w:val="ProgTableHours"/>
+            </w:pPr>
+            <w:r>
+              <w:t>3 h</w:t>
+            </w:r>
+          </w:p>
+        </w:tc>
+      </w:tr>
+      <w:tr>
+        <w:tc>
+          <w:tcPr>
+            <w:tcW w:type="dxa" w:w="567"/>
+          </w:tcPr>
+          <w:p>
+            <w:pPr>
+              <w:pStyle w:val="ProgTableId"/>
+            </w:pPr>
+            <w:r>
+              <w:t>3.8</w:t>
             </w:r>
           </w:p>
         </w:tc>
@@ -2523,7 +2889,7 @@
               <w:pStyle w:val="ProgTableMuted"/>
             </w:pPr>
             <w:r>
-              <w:t>Exposé + lab</w:t>
+              <w:t>Cours + TP</w:t>
             </w:r>
           </w:p>
         </w:tc>
@@ -2536,275 +2902,7 @@
               <w:pStyle w:val="ProgTableHours"/>
             </w:pPr>
             <w:r>
-              <w:t>3 h</w:t>
-            </w:r>
-          </w:p>
-        </w:tc>
-      </w:tr>
-      <w:tr>
-        <w:tc>
-          <w:tcPr>
-            <w:tcW w:type="dxa" w:w="567"/>
-          </w:tcPr>
-          <w:p>
-            <w:pPr>
-              <w:pStyle w:val="ProgTableId"/>
-            </w:pPr>
-            <w:r>
-              <w:t>3.5</w:t>
-            </w:r>
-          </w:p>
-        </w:tc>
-        <w:tc>
-          <w:tcPr>
-            <w:tcW w:type="dxa" w:w="2211"/>
-          </w:tcPr>
-          <w:p>
-            <w:pPr>
-              <w:pStyle w:val="ProgTableStrong"/>
-            </w:pPr>
-            <w:r>
-              <w:t>Projet Ansible</w:t>
-            </w:r>
-          </w:p>
-        </w:tc>
-        <w:tc>
-          <w:tcPr>
-            <w:tcW w:type="dxa" w:w="4876"/>
-          </w:tcPr>
-          <w:p>
-            <w:pPr>
-              <w:pStyle w:val="ProgTableText"/>
-            </w:pPr>
-            <w:r>
-              <w:t>Configurer une pile web multi-serveurs : serveur web, application, base de données, TLS</w:t>
-            </w:r>
-          </w:p>
-        </w:tc>
-        <w:tc>
-          <w:tcPr>
-            <w:tcW w:type="dxa" w:w="1134"/>
-          </w:tcPr>
-          <w:p>
-            <w:pPr>
-              <w:pStyle w:val="ProgTableMuted"/>
-            </w:pPr>
-            <w:r>
-              <w:t>Lab</w:t>
-            </w:r>
-          </w:p>
-        </w:tc>
-        <w:tc>
-          <w:tcPr>
-            <w:tcW w:type="dxa" w:w="850"/>
-          </w:tcPr>
-          <w:p>
-            <w:pPr>
-              <w:pStyle w:val="ProgTableHours"/>
-            </w:pPr>
-            <w:r>
-              <w:t>1,5 h</w:t>
-            </w:r>
-          </w:p>
-        </w:tc>
-      </w:tr>
-      <w:tr>
-        <w:tc>
-          <w:tcPr>
-            <w:tcW w:type="dxa" w:w="567"/>
-          </w:tcPr>
-          <w:p>
-            <w:pPr>
-              <w:pStyle w:val="ProgTableId"/>
-            </w:pPr>
-            <w:r>
-              <w:t>3.6</w:t>
-            </w:r>
-          </w:p>
-        </w:tc>
-        <w:tc>
-          <w:tcPr>
-            <w:tcW w:type="dxa" w:w="2211"/>
-          </w:tcPr>
-          <w:p>
-            <w:pPr>
-              <w:pStyle w:val="ProgTableStrong"/>
-            </w:pPr>
-            <w:r>
-              <w:t>Bases de Terraform</w:t>
-            </w:r>
-          </w:p>
-        </w:tc>
-        <w:tc>
-          <w:tcPr>
-            <w:tcW w:type="dxa" w:w="4876"/>
-          </w:tcPr>
-          <w:p>
-            <w:pPr>
-              <w:pStyle w:val="ProgTableText"/>
-            </w:pPr>
-            <w:r>
-              <w:t>Providers, syntaxe HCL, ressources, data sources, graphe de dépendances, plan et apply</w:t>
-            </w:r>
-          </w:p>
-        </w:tc>
-        <w:tc>
-          <w:tcPr>
-            <w:tcW w:type="dxa" w:w="1134"/>
-          </w:tcPr>
-          <w:p>
-            <w:pPr>
-              <w:pStyle w:val="ProgTableMuted"/>
-            </w:pPr>
-            <w:r>
-              <w:t>Exposé + lab</w:t>
-            </w:r>
-          </w:p>
-        </w:tc>
-        <w:tc>
-          <w:tcPr>
-            <w:tcW w:type="dxa" w:w="850"/>
-          </w:tcPr>
-          <w:p>
-            <w:pPr>
-              <w:pStyle w:val="ProgTableHours"/>
-            </w:pPr>
-            <w:r>
-              <w:t>3 h</w:t>
-            </w:r>
-          </w:p>
-        </w:tc>
-      </w:tr>
-      <w:tr>
-        <w:tc>
-          <w:tcPr>
-            <w:tcW w:type="dxa" w:w="567"/>
-          </w:tcPr>
-          <w:p>
-            <w:pPr>
-              <w:pStyle w:val="ProgTableId"/>
-            </w:pPr>
-            <w:r>
-              <w:t>3.7</w:t>
-            </w:r>
-          </w:p>
-        </w:tc>
-        <w:tc>
-          <w:tcPr>
-            <w:tcW w:type="dxa" w:w="2211"/>
-          </w:tcPr>
-          <w:p>
-            <w:pPr>
-              <w:pStyle w:val="ProgTableStrong"/>
-            </w:pPr>
-            <w:r>
-              <w:t>État &amp; variables Terraform</w:t>
-            </w:r>
-          </w:p>
-        </w:tc>
-        <w:tc>
-          <w:tcPr>
-            <w:tcW w:type="dxa" w:w="4876"/>
-          </w:tcPr>
-          <w:p>
-            <w:pPr>
-              <w:pStyle w:val="ProgTableText"/>
-            </w:pPr>
-            <w:r>
-              <w:t>Variables et validation, outputs, état, backends distants et verrouillage de l’état</w:t>
-            </w:r>
-          </w:p>
-        </w:tc>
-        <w:tc>
-          <w:tcPr>
-            <w:tcW w:type="dxa" w:w="1134"/>
-          </w:tcPr>
-          <w:p>
-            <w:pPr>
-              <w:pStyle w:val="ProgTableMuted"/>
-            </w:pPr>
-            <w:r>
-              <w:t>Exposé + lab</w:t>
-            </w:r>
-          </w:p>
-        </w:tc>
-        <w:tc>
-          <w:tcPr>
-            <w:tcW w:type="dxa" w:w="850"/>
-          </w:tcPr>
-          <w:p>
-            <w:pPr>
-              <w:pStyle w:val="ProgTableHours"/>
-            </w:pPr>
-            <w:r>
-              <w:t>3 h</w:t>
-            </w:r>
-          </w:p>
-        </w:tc>
-      </w:tr>
-      <w:tr>
-        <w:tc>
-          <w:tcPr>
-            <w:tcW w:type="dxa" w:w="567"/>
-          </w:tcPr>
-          <w:p>
-            <w:pPr>
-              <w:pStyle w:val="ProgTableId"/>
-            </w:pPr>
-            <w:r>
-              <w:t>3.8</w:t>
-            </w:r>
-          </w:p>
-        </w:tc>
-        <w:tc>
-          <w:tcPr>
-            <w:tcW w:type="dxa" w:w="2211"/>
-          </w:tcPr>
-          <w:p>
-            <w:pPr>
-              <w:pStyle w:val="ProgTableStrong"/>
-            </w:pPr>
-            <w:r>
-              <w:t>Modules &amp; environnements</w:t>
-            </w:r>
-          </w:p>
-        </w:tc>
-        <w:tc>
-          <w:tcPr>
-            <w:tcW w:type="dxa" w:w="4876"/>
-          </w:tcPr>
-          <w:p>
-            <w:pPr>
-              <w:pStyle w:val="ProgTableText"/>
-            </w:pPr>
-            <w:r>
-              <w:t>Écrire et versionner des modules, workspaces, import de ressources existantes, organisation du code</w:t>
-            </w:r>
-          </w:p>
-        </w:tc>
-        <w:tc>
-          <w:tcPr>
-            <w:tcW w:type="dxa" w:w="1134"/>
-          </w:tcPr>
-          <w:p>
-            <w:pPr>
-              <w:pStyle w:val="ProgTableMuted"/>
-            </w:pPr>
-            <w:r>
-              <w:t>Exposé + lab</w:t>
-            </w:r>
-          </w:p>
-        </w:tc>
-        <w:tc>
-          <w:tcPr>
-            <w:tcW w:type="dxa" w:w="850"/>
-          </w:tcPr>
-          <w:p>
-            <w:pPr>
-              <w:pStyle w:val="ProgTableHours"/>
-            </w:pPr>
-            <w:r>
-              <w:t>3 h</w:t>
+              <w:t>1,5 h</w:t>
             </w:r>
           </w:p>
         </w:tc>
@@ -2832,7 +2930,7 @@
               <w:pStyle w:val="ProgTableStrong"/>
             </w:pPr>
             <w:r>
-              <w:t>Projet Terraform</w:t>
+              <w:t>Projet Ansible</w:t>
             </w:r>
           </w:p>
         </w:tc>
@@ -2845,7 +2943,7 @@
               <w:pStyle w:val="ProgTableText"/>
             </w:pPr>
             <w:r>
-              <w:t>Provisionner l’environnement cloud (réseau, calcul, base de données) de l’application du cours</w:t>
+              <w:t>Configurer les serveurs d’outils EC2 (agents Jenkins, SonarQube, Nexus) avec des rôles, puis relancer pour prouver l’idempotence</w:t>
             </w:r>
           </w:p>
         </w:tc>
@@ -2858,7 +2956,7 @@
               <w:pStyle w:val="ProgTableMuted"/>
             </w:pPr>
             <w:r>
-              <w:t>Lab</w:t>
+              <w:t>TP</w:t>
             </w:r>
           </w:p>
         </w:tc>
@@ -2871,7 +2969,7 @@
               <w:pStyle w:val="ProgTableHours"/>
             </w:pPr>
             <w:r>
-              <w:t>3 h</w:t>
+              <w:t>1,5 h</w:t>
             </w:r>
           </w:p>
         </w:tc>
@@ -2898,7 +2996,7 @@
       <w:r>
         <w:t>Phase 04</w:t>
         <w:tab/>
-        <w:t>6 h</w:t>
+        <w:t>6 h</w:t>
       </w:r>
     </w:p>
     <w:p>
@@ -2906,7 +3004,7 @@
         <w:pStyle w:val="Heading1"/>
       </w:pPr>
       <w:r>
-        <w:t>Observabilité</w:t>
+        <w:t>Supervision</w:t>
       </w:r>
     </w:p>
     <w:p>
@@ -2914,7 +3012,7 @@
         <w:pStyle w:val="ProgIntro"/>
       </w:pPr>
       <w:r>
-        <w:t>Une chaîne de livraison n’est terminée que lorsque l’équipe voit ce qui tourne en production. Les participants instrumentent l’application du cours, écrivent les requêtes derrière des tableaux de bord utiles et les transforment en alertes.</w:t>
+        <w:t>Une chaîne de livraison n’est terminée que lorsque l’équipe voit ce qui tourne en production. Les participants instrumentent l’application du cours, construisent des tableaux de bord à partir des métriques et des journaux, et acheminent les alertes vers les bonnes personnes.</w:t>
       </w:r>
     </w:p>
     <w:tbl>
@@ -3023,7 +3121,7 @@
               <w:pStyle w:val="ProgTableStrong"/>
             </w:pPr>
             <w:r>
-              <w:t>Prometheus</w:t>
+              <w:t>Métriques et alertes avec Prometheus</w:t>
             </w:r>
           </w:p>
         </w:tc>
@@ -3036,7 +3134,7 @@
               <w:pStyle w:val="ProgTableText"/>
             </w:pPr>
             <w:r>
-              <w:t>Modèle de métriques, exporters, découverte de services, PromQL, règles d’enregistrement et d’alerte</w:t>
+              <w:t>Modèle de métriques, exporters, instrumentation de l’application avec les bibliothèques clientes, PromQL, règles d’enregistrement et d’alerte, routage avec Alertmanager</w:t>
             </w:r>
           </w:p>
         </w:tc>
@@ -3049,7 +3147,7 @@
               <w:pStyle w:val="ProgTableMuted"/>
             </w:pPr>
             <w:r>
-              <w:t>Exposé + lab</w:t>
+              <w:t>Cours + TP</w:t>
             </w:r>
           </w:p>
         </w:tc>
@@ -3062,7 +3160,7 @@
               <w:pStyle w:val="ProgTableHours"/>
             </w:pPr>
             <w:r>
-              <w:t>3 h</w:t>
+              <w:t>3 h</w:t>
             </w:r>
           </w:p>
         </w:tc>
@@ -3090,7 +3188,7 @@
               <w:pStyle w:val="ProgTableStrong"/>
             </w:pPr>
             <w:r>
-              <w:t>Grafana</w:t>
+              <w:t>Tableaux de bord et journaux avec Grafana</w:t>
             </w:r>
           </w:p>
         </w:tc>
@@ -3103,7 +3201,7 @@
               <w:pStyle w:val="ProgTableText"/>
             </w:pPr>
             <w:r>
-              <w:t>Sources de données, tableaux de bord, alertes et canaux de notification, objectifs de niveau de service</w:t>
+              <w:t>Tableaux de bord, Loki pour les journaux, règles d’alerte Grafana, points de contact et politiques de notification, objectifs de niveau de service (SLO)</w:t>
             </w:r>
           </w:p>
         </w:tc>
@@ -3116,7 +3214,7 @@
               <w:pStyle w:val="ProgTableMuted"/>
             </w:pPr>
             <w:r>
-              <w:t>Exposé + lab</w:t>
+              <w:t>Cours + TP</w:t>
             </w:r>
           </w:p>
         </w:tc>
@@ -3129,7 +3227,7 @@
               <w:pStyle w:val="ProgTableHours"/>
             </w:pPr>
             <w:r>
-              <w:t>3 h</w:t>
+              <w:t>3 h</w:t>
             </w:r>
           </w:p>
         </w:tc>
@@ -3156,7 +3254,7 @@
       <w:r>
         <w:t>Phase 05</w:t>
         <w:tab/>
-        <w:t>9 h</w:t>
+        <w:t>9 h</w:t>
       </w:r>
     </w:p>
     <w:p>
@@ -3172,7 +3270,7 @@
         <w:pStyle w:val="ProgIntro"/>
       </w:pPr>
       <w:r>
-        <w:t>Par équipes de deux ou trois, les participants assemblent tout le programme en une chaîne de livraison fonctionnelle pour une application fournie, puis la présentent comme à un responsable technique.</w:t>
+        <w:t>Par équipes de deux ou trois, les participants assemblent tout le programme en une chaîne de livraison fonctionnelle pour une application fournie, puis la présentent comme ils le feraient devant un responsable technique.</w:t>
       </w:r>
     </w:p>
     <w:tbl>
@@ -3281,7 +3379,7 @@
               <w:pStyle w:val="ProgTableStrong"/>
             </w:pPr>
             <w:r>
-              <w:t>Cahier des charges &amp; conception</w:t>
+              <w:t>Cahier des charges et conception</w:t>
             </w:r>
           </w:p>
         </w:tc>
@@ -3294,7 +3392,7 @@
               <w:pStyle w:val="ProgTableText"/>
             </w:pPr>
             <w:r>
-              <w:t>Lire le besoin, dessiner l’architecture cible, découper le travail en backlog</w:t>
+              <w:t>Analyser le besoin, dessiner l’architecture cible, découper le travail en backlog</w:t>
             </w:r>
           </w:p>
         </w:tc>
@@ -3320,7 +3418,7 @@
               <w:pStyle w:val="ProgTableHours"/>
             </w:pPr>
             <w:r>
-              <w:t>1,5 h</w:t>
+              <w:t>1,5 h</w:t>
             </w:r>
           </w:p>
         </w:tc>
@@ -3361,7 +3459,7 @@
               <w:pStyle w:val="ProgTableText"/>
             </w:pPr>
             <w:r>
-              <w:t>Flux Git, pipeline CI avec barrière de qualité et artefacts, infrastructure avec Terraform et Ansible, déploiement sur Kubernetes</w:t>
+              <w:t>Workflow Git ; intégration continue avec tests, seuil de qualité et artefacts versionnés ; infrastructure AWS avec Terraform ; serveurs d’outils configurés par Ansible ; déploiement sur EKS avec une stratégie de mise en production</w:t>
             </w:r>
           </w:p>
         </w:tc>
@@ -3387,7 +3485,7 @@
               <w:pStyle w:val="ProgTableHours"/>
             </w:pPr>
             <w:r>
-              <w:t>4,5 h</w:t>
+              <w:t>4,5 h</w:t>
             </w:r>
           </w:p>
         </w:tc>
@@ -3415,7 +3513,7 @@
               <w:pStyle w:val="ProgTableStrong"/>
             </w:pPr>
             <w:r>
-              <w:t>Supervision &amp; documentation</w:t>
+              <w:t>Supervision et documentation</w:t>
             </w:r>
           </w:p>
         </w:tc>
@@ -3428,7 +3526,7 @@
               <w:pStyle w:val="ProgTableText"/>
             </w:pPr>
             <w:r>
-              <w:t>Tableaux de bord et alertes, README, schéma d’architecture, runbook</w:t>
+              <w:t>Métriques, journaux, tableaux de bord et alertes ; README, schéma d’architecture, runbook (procédures d’exploitation)</w:t>
             </w:r>
           </w:p>
         </w:tc>
@@ -3454,7 +3552,7 @@
               <w:pStyle w:val="ProgTableHours"/>
             </w:pPr>
             <w:r>
-              <w:t>1,5 h</w:t>
+              <w:t>1,5 h</w:t>
             </w:r>
           </w:p>
         </w:tc>
@@ -3482,7 +3580,7 @@
               <w:pStyle w:val="ProgTableStrong"/>
             </w:pPr>
             <w:r>
-              <w:t>Démonstration &amp; revue</w:t>
+              <w:t>Démonstration et revue</w:t>
             </w:r>
           </w:p>
         </w:tc>
@@ -3495,7 +3593,7 @@
               <w:pStyle w:val="ProgTableText"/>
             </w:pPr>
             <w:r>
-              <w:t>Démonstration en direct d’une modification qui va du commit à la production, questions, retours</w:t>
+              <w:t>Démonstration en direct d’une modification qui va du commit à la production, puis d’un retour arrière ; questions et retours</w:t>
             </w:r>
           </w:p>
         </w:tc>
@@ -3521,7 +3619,7 @@
               <w:pStyle w:val="ProgTableHours"/>
             </w:pPr>
             <w:r>
-              <w:t>1,5 h</w:t>
+              <w:t>1,5 h</w:t>
             </w:r>
           </w:p>
         </w:tc>
@@ -3537,7 +3635,7 @@
         <w:pStyle w:val="ProgBoxTag"/>
       </w:pPr>
       <w:r>
-        <w:t>Projet 1</w:t>
+        <w:t>Projet final</w:t>
       </w:r>
     </w:p>
     <w:p>
@@ -3553,7 +3651,7 @@
         <w:pStyle w:val="ProgBoxText"/>
       </w:pPr>
       <w:r>
-        <w:t>Une modification poussée dans Git est testée, analysée, versionnée et déployée automatiquement sur une infrastructure que l’équipe a provisionnée en code, et son état est visible sur un tableau de bord avec alertes.</w:t>
+        <w:t>Une modification poussée dans Git est testée, analysée, versionnée et déployée automatiquement sur une infrastructure AWS que l’équipe a provisionnée en code. Son état est visible sur des tableaux de bord avec alertes, et une mauvaise version peut être annulée.</w:t>
       </w:r>
     </w:p>
     <w:p>
@@ -3567,7 +3665,7 @@
         <w:t>Outils</w:t>
       </w:r>
       <w:r>
-        <w:t xml:space="preserve">  Git, GitHub, Jenkins ou GitHub Actions, SonarQube, Nexus, Terraform, Ansible, Docker, Kubernetes, Prometheus, Grafana</w:t>
+        <w:t xml:space="preserve">  Git, GitHub, Jenkins ou GitHub Actions, SonarQube, Nexus, Terraform, Ansible, Docker, Kubernetes (EKS), Helm, Prometheus, Grafana, Loki</w:t>
       </w:r>
     </w:p>
     <w:p>
@@ -3666,7 +3764,7 @@
       <w:fldChar w:fldCharType="end"/>
     </w:r>
     <w:r>
-      <w:t xml:space="preserve"> of </w:t>
+      <w:t xml:space="preserve"> sur </w:t>
     </w:r>
     <w:r>
       <w:fldChar w:fldCharType="begin"/>

</xml_diff>